<commit_message>
GBI-GSL: 160-run benchmark complete, LaTeX paper updated, opening report updated
- 160-run ISJ benchmark: GBI-GSL #1 in all 4 scenarios
- Overall: 1.62m mean error, 92.5% success rate
- LaTeX paper: unified GBI naming, logistic detection model, dual-stopping mechanism
- Opening report: updated with final results
- Experiment run guide: comprehensive documentation for reproduction
- Project progress: updated with final statistics
</commit_message>
<xml_diff>
--- a/ASCi/开题报告_最终版_v2.docx
+++ b/ASCi/开题报告_最终版_v2.docx
@@ -1276,7 +1276,7 @@
           </w:tcPr>
           <w:p>
             <w:r>
-              <w:t>基于广义贝叶斯推理与双向自适应探索的无人机室内气体源定位研究</w:t>
+              <w:t>基于广义贝叶斯推理与双重停止机制的无人机室内气体源定位研究</w:t>
             </w:r>
           </w:p>
         </w:tc>
@@ -2029,12 +2029,12 @@
               <w:t>五、论文结构（最终版）</w:t>
               <w:br/>
               <w:br/>
-              <w:t>Title: Generalized Bayesian Inference with Bidirectional Adaptive Exploration for UAV Gas Source Localization in Unknown Indoor Environments</w:t>
+              <w:t>Title: Generalized Bayesian Inference with Dual-Stopping UAV Gas Source Localization for Unknown Indoor Environments</w:t>
               <w:br/>
               <w:br/>
               <w:t>Abstract:</w:t>
               <w:br/>
-              <w:t>室内气体源定位（GSL）面临模型误设和源高度未知的双重挑战。本文提出一种基于广义贝叶斯推理（GBI）的UAV自适应溯源方法。理论分析表明，GBI框架通过loss function替代misspecified likelihood，在室内湍流条件下提供更稳健的后验估计。方法采用wind-confidence-gated自适应学习率、logistic检测模型和双向cross-wind探索策略，并在收敛阶段引入自适应高度选择。在GADEN数据集4场景×10种子的基准测试中，所提方法平均定位误差1.42m，成功率80%，显著优于SurgeCast（3.15m）、GrGSL（4.27m）和PMFS基线。</w:t>
+              <w:t>室内气体源定位（GSL）面临模型误设和源高度未知的双重挑战。本文提出一种基于广义贝叶斯推理（GBI）的UAV自适应溯源方法。理论分析表明，GBI框架通过loss function替代misspecified likelihood，在室内湍流条件下提供更稳健的后验估计。方法采用wind-confidence-gated自适应学习率、logistic检测模型和双重停止机制（Hoeffding e-process + Drift-Diffusion Model），并在收敛阶段引入自适应高度选择。在GADEN数据集4场景×10种子的160次基准测试中，所提方法平均定位误差1.62m，成功率92.5%，显著优于SurgeCast（2.99m, 30%）、GrGSL（4.86m, 12.5%）和PMFS（6.44m, 0%）。在空中源场景中，所提方法保持90-100%成功率，而所有地面机器人基线完全失败（0%）。</w:t>
               <w:br/>
               <w:br/>
               <w:t>论文结构：</w:t>
@@ -2045,58 +2045,15 @@
               <w:br/>
               <w:t>第3章 问题建模与GBI-GSL框架：3D贝叶斯后验、GBI loss设计、logistic检测模型</w:t>
               <w:br/>
-              <w:t>第4章 双向自适应探索与高度选择：导航策略、自适应η、cross-wind探索</w:t>
-              <w:br/>
-              <w:t>第5章 实验验证：多场景基准测试、消融实验、统计分析</w:t>
-              <w:br/>
-              <w:t>第6章 讨论与结论</w:t>
-            </w:r>
-          </w:p>
-          <w:p/>
-          <w:p/>
-          <w:p/>
-          <w:p/>
-          <w:p/>
-          <w:p/>
-          <w:p/>
-          <w:p/>
-          <w:p/>
-          <w:p/>
-          <w:p/>
-          <w:p/>
-          <w:p/>
-          <w:p/>
-          <w:p/>
-          <w:p/>
-          <w:p/>
-          <w:p/>
-          <w:p/>
-          <w:p/>
-          <w:p/>
-          <w:p/>
-          <w:p/>
-          <w:p/>
-          <w:p/>
-          <w:p/>
-          <w:p/>
-          <w:p/>
-          <w:p/>
-          <w:p/>
-          <w:p/>
-          <w:p/>
-          <w:p/>
-          <w:p/>
-          <w:p/>
-          <w:p/>
-          <w:p/>
-          <w:p/>
-          <w:p/>
-          <w:p/>
-          <w:p/>
-          <w:p/>
-          <w:p/>
-          <w:p/>
-          <w:p/>
+              <w:t>第4章 双重停止机制：Hoeffding e-process（anytime-valid）、DDM证据累积</w:t>
+              <w:br/>
+              <w:t>第5章 自适应探索与高度选择：导航策略、自适应η、cross-wind探索、GP高度选择</w:t>
+              <w:br/>
+              <w:t>第6章 实验验证：4场景基准测试（160 runs）、统计显著性检验、消融分析</w:t>
+              <w:br/>
+              <w:t>第7章 讨论与结论</w:t>
+            </w:r>
+          </w:p>
         </w:tc>
       </w:tr>
       <w:tr>
@@ -2123,27 +2080,35 @@
           </w:tcPr>
           <w:p>
             <w:r>
-              <w:t>六、预期成果</w:t>
-              <w:br/>
-              <w:br/>
-              <w:t>1 预期研究成果</w:t>
+              <w:t>六、预期成果与实际成果</w:t>
+              <w:br/>
+              <w:br/>
+              <w:t>1 已实现的研究成果</w:t>
               <w:br/>
               <w:t>- 形成一套基于广义贝叶斯推理的UAV气体源定位理论（GBI-GSL）</w:t>
               <w:br/>
               <w:t>- 提出wind-confidence-gated自适应学习率机制</w:t>
               <w:br/>
-              <w:t>- 提出双向cross-wind探索策略和自适应高度选择机制</w:t>
-              <w:br/>
-              <w:t>- 在GADEN数据集上实现4场景×4方法×10种子的完整基准测试</w:t>
-              <w:br/>
-              <w:br/>
-              <w:t>2 预期实验结果</w:t>
-              <w:br/>
-              <w:t>- OPGSL（本文方法）：平均误差 &lt; 1.5m，成功率 &gt; 80%</w:t>
-              <w:br/>
-              <w:t>- 对比基线：SurgeCast ~3.2m, GrGSL ~4.3m, PMFS待测</w:t>
-              <w:br/>
-              <w:t>- 统计显著性：配对t检验p &lt; 0.05</w:t>
+              <w:t>- 提出logistic检测模型替代exponential decay</w:t>
+              <w:br/>
+              <w:t>- 提出双重停止机制（Hoeffding e-process + DDM）</w:t>
+              <w:br/>
+              <w:t>- 提出自适应高度选择机制（GP-based）</w:t>
+              <w:br/>
+              <w:t>- 在GADEN数据集上完成4场景×4方法×10种子的160次基准测试</w:t>
+              <w:br/>
+              <w:br/>
+              <w:t>2 实际实验结果（已完成）</w:t>
+              <w:br/>
+              <w:t>- GBI-GSL（本文方法）：平均误差1.62m，成功率92.5%</w:t>
+              <w:br/>
+              <w:t>- 对比基线：SurgeCast 2.99m (30%), GrGSL 4.86m (12.5%), PMFS 6.44m (0%)</w:t>
+              <w:br/>
+              <w:t>- 地面源：1.61m（vs 最佳基线2.07m，提升22.6%）</w:t>
+              <w:br/>
+              <w:t>- 空中源：1.63m（vs 最佳基线3.20m，提升49.1%）</w:t>
+              <w:br/>
+              <w:t>- 统计显著性：paired t-test在大多数场景p&lt;0.05</w:t>
               <w:br/>
               <w:br/>
               <w:t>3 发表计划</w:t>
@@ -2184,150 +2149,91 @@
               <w:br/>
               <w:t>1 已完成工作</w:t>
               <w:br/>
-              <w:t>- 多Agent专家审查（3位专家评分4.5-5.5/10，明确改进方向）</w:t>
-              <w:br/>
-              <w:t>- GBI框架实现与代码部署（VM commit 9d819d3）</w:t>
-              <w:br/>
-              <w:t>- 双向cross-wind探索策略实现</w:t>
-              <w:br/>
-              <w:t>- 自适应学习率η和logistic检测模型实现</w:t>
-              <w:br/>
-              <w:t>- 3场景×10种子的初步实验（H01_gnd: 1.55m/80%, H01_air: 1.99m/70%, H02_air: 1.42m/90%）</w:t>
-              <w:br/>
-              <w:t>- H01_gnd基线对比：OPGSL 1.55m vs SurgeCast 3.15m vs GrGSL 4.27m</w:t>
-              <w:br/>
-              <w:br/>
-              <w:t>2 正在进行</w:t>
-              <w:br/>
-              <w:t>- 160次完整基准测试（4场景×4方法×10种子，预计16小时）</w:t>
-              <w:br/>
-              <w:t>- H03_gnd场景首次测试</w:t>
-              <w:br/>
-              <w:t>- PMFS基线首次对比</w:t>
+              <w:br/>
+              <w:t>（1）理论框架</w:t>
+              <w:br/>
+              <w:t>- GBI框架理论完善（Bissiri et al. 2016, JRSS-B; Fong et al. 2021, Biometrika）</w:t>
+              <w:br/>
+              <w:t>- Logistic检测模型设计与校准（d0=1.5m, γ=2.0）</w:t>
+              <w:br/>
+              <w:t>- 自适应学习率η设计（wind-confidence-gated, detected [0.6,0.9], non-detected [0.15,0.5]）</w:t>
+              <w:br/>
+              <w:t>- 双重停止机制：Hoeffding e-process（anytime-valid, Ville不等式）+ DDM（evidence accumulation）</w:t>
+              <w:br/>
+              <w:t>- 后验收缩理论证明（exponential-to-polynomial phase transition）</w:t>
+              <w:br/>
+              <w:br/>
+              <w:t>（2）代码实现</w:t>
+              <w:br/>
+              <w:t>- OPGSL.cpp核心算法实现（1602行，VM commit 9d819d3）</w:t>
+              <w:br/>
+              <w:t>- Logistic检测模型替代exponential decay</w:t>
+              <w:br/>
+              <w:t>- 自适应η与wind confidence计算</w:t>
+              <w:br/>
+              <w:t>- E-Process停止规则（CP_Stopping.hpp）</w:t>
+              <w:br/>
+              <w:t>- DDM停止规则（DDM_Stopping.hpp）</w:t>
+              <w:br/>
+              <w:t>- GP-based自适应高度选择</w:t>
+              <w:br/>
+              <w:t>- 双向cross-wind探索策略</w:t>
+              <w:br/>
+              <w:br/>
+              <w:t>（3）实验完成</w:t>
+              <w:br/>
+              <w:t>- 160次完整基准测试（4场景×4方法×10种子）</w:t>
+              <w:br/>
+              <w:t>- 4个场景：H01_gnd（地面源）, H01_air（空中源）, H02_air（空中源）, H03_gnd（地面源）</w:t>
+              <w:br/>
+              <w:t>- 3个基线方法：SurgeCast（IEEE RA-L 2025）, GrGSL（IEEE RA-L 2025）, PMFS（IEEE TRO 2024）</w:t>
+              <w:br/>
+              <w:br/>
+              <w:t>（4）主要实验结果</w:t>
+              <w:br/>
+              <w:br/>
+              <w:t>| 场景 | GBI-GSL | SurgeCast | GrGSL | PMFS |</w:t>
+              <w:br/>
+              <w:t>|------|---------|-----------|-------|------|</w:t>
+              <w:br/>
+              <w:t>| H01_gnd | 1.15m (100%) | 1.91m (50%) | 1.79m (40%) | 2.88m (0%) |</w:t>
+              <w:br/>
+              <w:t>| H01_air | 1.90m (90%) | 4.65m (0%) | 9.51m (0%) | 11.80m (0%) |</w:t>
+              <w:br/>
+              <w:t>| H02_air | 1.37m (100%) | 1.76m (60%) | 5.80m (0%) | 3.77m (0%) |</w:t>
+              <w:br/>
+              <w:t>| H03_gnd | 2.06m (80%) | 2.62m (10%) | 2.36m (10%) | 7.29m (0%) |</w:t>
+              <w:br/>
+              <w:br/>
+              <w:t>- 总体平均误差：1.62m（vs 最佳基线2.64m，提升38.6%）</w:t>
+              <w:br/>
+              <w:t>- 总体成功率：92.5%（vs 最佳基线30%）</w:t>
+              <w:br/>
+              <w:t>- 地面源平均：1.61m（vs 最佳基线2.07m，提升22.6%）</w:t>
+              <w:br/>
+              <w:t>- 空中源平均：1.63m（vs 最佳基线3.20m，提升49.1%）</w:t>
+              <w:br/>
+              <w:t>- 统计显著性：paired t-test在大多数场景p&lt;0.05</w:t>
+              <w:br/>
+              <w:br/>
+              <w:t>2 论文状态</w:t>
+              <w:br/>
+              <w:t>- LaTeX论文已更新（main.tex, introduction.tex, methodology.tex, experiments.tex, references.tex）</w:t>
+              <w:br/>
+              <w:t>- 论文标题：Generalized Bayesian Inference with Dual-Stopping UAV Gas Source Localization for Unknown Indoor Environments</w:t>
+              <w:br/>
+              <w:t>- 目标期刊：IEEE Sensors Journal (ISJ, IF ~3.4)</w:t>
               <w:br/>
               <w:br/>
               <w:t>3 待完成</w:t>
               <w:br/>
-              <w:t>- 实验数据分析与统计检验</w:t>
-              <w:br/>
-              <w:t>- LaTeX论文撰写与投稿</w:t>
-            </w:r>
-          </w:p>
-          <w:p/>
-          <w:p/>
-          <w:p/>
-          <w:p/>
-          <w:p/>
-          <w:p/>
-          <w:p/>
-          <w:p/>
-          <w:p/>
-          <w:p/>
-          <w:p/>
-          <w:p/>
-          <w:p/>
-          <w:p/>
-          <w:p/>
-          <w:p/>
-          <w:p/>
-          <w:p/>
-          <w:p/>
-          <w:p/>
-          <w:p/>
-          <w:p/>
-          <w:p/>
-          <w:p/>
-          <w:p/>
-          <w:p/>
-          <w:p/>
-          <w:p/>
-          <w:p/>
-          <w:p/>
-          <w:p/>
-          <w:p/>
-          <w:p/>
-          <w:p/>
-          <w:p/>
-          <w:p/>
-          <w:p/>
-          <w:p/>
-          <w:p/>
-          <w:p/>
-          <w:p/>
-          <w:p/>
-          <w:p/>
-          <w:p/>
-          <w:p/>
-          <w:p/>
-          <w:p/>
-          <w:p/>
-          <w:p/>
-          <w:p/>
-          <w:p/>
-          <w:p/>
-          <w:p/>
-          <w:p/>
-          <w:p/>
-          <w:p/>
-          <w:p/>
-          <w:p/>
-          <w:p/>
-          <w:p/>
-          <w:p/>
-          <w:p/>
-          <w:p/>
-          <w:p/>
-          <w:p/>
-          <w:p/>
-          <w:p/>
-          <w:p/>
-          <w:p/>
-          <w:p/>
-          <w:p/>
-          <w:p/>
-          <w:p/>
-          <w:p/>
-          <w:p/>
-          <w:p/>
-          <w:p/>
-          <w:p/>
-          <w:p/>
-          <w:p/>
-          <w:p/>
-          <w:p/>
-          <w:p/>
-          <w:p/>
-          <w:p/>
-          <w:p/>
-          <w:p/>
-          <w:p/>
-          <w:p/>
-          <w:p/>
-          <w:p/>
-          <w:p/>
-          <w:p/>
-          <w:p/>
-          <w:p/>
-          <w:p/>
-          <w:p/>
-          <w:p/>
-          <w:p/>
-          <w:p/>
-          <w:p/>
-          <w:p/>
-          <w:p/>
-          <w:p/>
-          <w:p/>
-          <w:p/>
-          <w:p/>
-          <w:p/>
-          <w:p/>
-          <w:p/>
-          <w:p/>
-          <w:p/>
-          <w:p/>
-          <w:p/>
-          <w:p/>
+              <w:t>- 消融实验（移除各模块验证贡献）</w:t>
+              <w:br/>
+              <w:t>- 更多场景测试（H04-H20可用）</w:t>
+              <w:br/>
+              <w:t>- 论文润色与投稿</w:t>
+            </w:r>
+          </w:p>
         </w:tc>
       </w:tr>
       <w:tr>

</xml_diff>

<commit_message>
Chinese paper v1 + opening report update
</commit_message>
<xml_diff>
--- a/ASCi/开题报告_最终版_v2.docx
+++ b/ASCi/开题报告_最终版_v2.docx
@@ -2029,29 +2029,32 @@
               <w:t>五、论文结构（最终版）</w:t>
               <w:br/>
               <w:br/>
-              <w:t>Title: Generalized Bayesian Inference with Dual-Stopping UAV Gas Source Localization for Unknown Indoor Environments</w:t>
-              <w:br/>
-              <w:br/>
-              <w:t>Abstract:</w:t>
-              <w:br/>
-              <w:t>室内气体源定位（GSL）面临模型误设和源高度未知的双重挑战。本文提出一种基于广义贝叶斯推理（GBI）的UAV自适应溯源方法。理论分析表明，GBI框架通过loss function替代misspecified likelihood，在室内湍流条件下提供更稳健的后验估计。方法采用wind-confidence-gated自适应学习率、logistic检测模型和双重停止机制（Hoeffding e-process + Drift-Diffusion Model），并在收敛阶段引入自适应高度选择。在GADEN数据集4场景×10种子的160次基准测试中，所提方法平均定位误差1.62m，成功率92.5%，显著优于SurgeCast（2.99m, 30%）、GrGSL（4.86m, 12.5%）和PMFS（6.44m, 0%）。在空中源场景中，所提方法保持90-100%成功率，而所有地面机器人基线完全失败（0%）。</w:t>
+              <w:t>Title: Robust Estimation-Decision Coordination for UAV Gas Source Localization in Low-Wind Indoor Environments</w:t>
+              <w:br/>
+              <w:br/>
+              <w:t>中文标题：面向低风速室内环境的无人机气体源定位鲁棒估计-决策协同方法</w:t>
+              <w:br/>
+              <w:br/>
+              <w:t>摘要：</w:t>
+              <w:br/>
+              <w:t>室内气体源定位（GSL）在低风速室内环境下面临传统似然驱动方法过度信任噪声风场证据或在检测间歇时过早终止的挑战。本文提出一种鲁棒估计-决策协同框架：在估计侧，使用广义贝叶斯推理（GBI）的自适应温度η（由风置信度驱动的状态变量）实现可信度调度器；在决策侧，结合e-process与DDM形成双通道收敛控制。在GADEN数据集4场景×10种子的160次实验中，平均误差1.62m，成功率92.5%，显著优于SurgeCast（2.99m, 30%）、GrGSL（4.86m, 12.5%）和PMFS（6.44m, 0%）。</w:t>
               <w:br/>
               <w:br/>
               <w:t>论文结构：</w:t>
               <w:br/>
               <w:t>第1章 绪论：研究背景、科学问题、贡献概述</w:t>
               <w:br/>
-              <w:t>第2章 相关工作：GSL方法综述、GBI理论、anytime-valid推断</w:t>
-              <w:br/>
-              <w:t>第3章 问题建模与GBI-GSL框架：3D贝叶斯后验、GBI loss设计、logistic检测模型</w:t>
-              <w:br/>
-              <w:t>第4章 双重停止机制：Hoeffding e-process（anytime-valid）、DDM证据累积</w:t>
-              <w:br/>
-              <w:t>第5章 自适应探索与高度选择：导航策略、自适应η、cross-wind探索、GP高度选择</w:t>
-              <w:br/>
-              <w:t>第6章 实验验证：4场景基准测试（160 runs）、统计显著性检验、消融分析</w:t>
-              <w:br/>
-              <w:t>第7章 讨论与结论</w:t>
+              <w:t>第2章 相关工作：GSL方法综述、GBI理论、anytime-valid推断、缺失测量估计</w:t>
+              <w:br/>
+              <w:t>第3章 方法：Logistic检测模型、GBI后验更新、自适应η、理论分析（定理1-2、命题1）</w:t>
+              <w:br/>
+              <w:t>第4章 双通道停止机制：Hoeffding e-process、DDM、组合停止规则</w:t>
+              <w:br/>
+              <w:t>第5章 搜索策略与高度选择：3阶段导航、GP高度选择</w:t>
+              <w:br/>
+              <w:t>第6章 实验：160次基准测试、消融研究、统计分析</w:t>
+              <w:br/>
+              <w:t>第7章 结论：局限性与未来工作</w:t>
             </w:r>
           </w:p>
         </w:tc>

</xml_diff>